<commit_message>
Number check: verify year-like amounts; flag segment figures
- Amounts from 1,900 to 2,100 ("$2,002 million") were skipped as years and
  never verified. A $ sign or thousands comma now always marks an amount.
  The Phase 17 stress test shows the effect: six planted numbers ($1,942,
  $1,914, $1,945) that passed before are now caught; invented-number
  detection 96.5% -> 97.5%, "last digit +1" 100%.
- A number tagged in iXBRL as one business segment's (or region's) figure,
  while the filing reports a different company-wide figure for the same
  line item and period, now carries a warning with the segment and the
  company total (e.g. Microsoft's Productivity and Business Processes
  operating income quoted as "operating income"). Product/service
  breakdowns are not segments; the warning did not fire on the 434
  numbers of the saved G5-G8 answers.

README, report and diagram updated; Phase 17 results regenerated.

Co-Authored-By: Claude Opus 5.5 <noreply@anthropic.com>
</commit_message>
<xml_diff>
--- a/docs/SEC_EDGAR_RAG_Architecture_Report.docx
+++ b/docs/SEC_EDGAR_RAG_Architecture_Report.docx
@@ -104,7 +104,7 @@
           <w:i w:val="0"/>
           <w:sz w:val="20"/>
         </w:rPr>
-        <w:t>Generated 2026-09-29 from the repository state at commit c7d9cee</w:t>
+        <w:t>Generated 2026-09-29 from the repository state at commit 655fdca</w:t>
       </w:r>
     </w:p>
     <w:p>
@@ -287,7 +287,7 @@
         <w:t xml:space="preserve">What the number check cannot see: </w:t>
       </w:r>
       <w:r>
-        <w:t>planted invented numbers were flagged 96.5% of the time, planted wrong-cell numbers 0.0%. In the &lt;calc&gt; runs (G5, G6, G7) none of the 19 wrong answers was flagged: they quote real figures from another period, filing, row or column, or miss a fact retrieval did not find (Section 5.16).</w:t>
+        <w:t>planted invented numbers were flagged 97.5% of the time, planted wrong-cell numbers 0.0%. In the &lt;calc&gt; runs (G5, G6, G7) none of the 19 wrong answers was flagged: they quote real figures from another period, filing, row or column, or miss a fact retrieval did not find (Section 5.16).</w:t>
       </w:r>
     </w:p>
     <w:p>
@@ -3519,7 +3519,7 @@
               <w:rPr>
                 <w:sz w:val="17"/>
               </w:rPr>
-              <w:t>59 unit tests pinning parser, chunker, retrieval metrics, number safeguards, judge guards, API, tracing and the Phase 17 locators</w:t>
+              <w:t>67 unit tests pinning parser, chunker, retrieval metrics, number safeguards, judge guards, API, tracing and the Phase 17 locators</w:t>
             </w:r>
           </w:p>
         </w:tc>
@@ -5125,6 +5125,226 @@
                 <w:sz w:val="15"/>
               </w:rPr>
               <w:t>README: Mermaid system architecture and retrieval-evolution diagrams</w:t>
+            </w:r>
+          </w:p>
+        </w:tc>
+      </w:tr>
+      <w:tr>
+        <w:tc>
+          <w:tcPr>
+            <w:tcW w:type="dxa" w:w="907"/>
+          </w:tcPr>
+          <w:p>
+            <w:r/>
+            <w:r>
+              <w:rPr>
+                <w:sz w:val="15"/>
+              </w:rPr>
+              <w:t>791c596</w:t>
+            </w:r>
+          </w:p>
+        </w:tc>
+        <w:tc>
+          <w:tcPr>
+            <w:tcW w:type="dxa" w:w="1587"/>
+          </w:tcPr>
+          <w:p>
+            <w:r/>
+            <w:r>
+              <w:rPr>
+                <w:sz w:val="15"/>
+              </w:rPr>
+              <w:t>2026-09-29 18:12</w:t>
+            </w:r>
+          </w:p>
+        </w:tc>
+        <w:tc>
+          <w:tcPr>
+            <w:tcW w:type="dxa" w:w="7143"/>
+          </w:tcPr>
+          <w:p>
+            <w:r/>
+            <w:r>
+              <w:rPr>
+                <w:sz w:val="15"/>
+              </w:rPr>
+              <w:t>Phase 17: numerical-hallucination evaluation</w:t>
+            </w:r>
+          </w:p>
+        </w:tc>
+      </w:tr>
+      <w:tr>
+        <w:tc>
+          <w:tcPr>
+            <w:tcW w:type="dxa" w:w="907"/>
+          </w:tcPr>
+          <w:p>
+            <w:r/>
+            <w:r>
+              <w:rPr>
+                <w:sz w:val="15"/>
+              </w:rPr>
+              <w:t>13f42a4</w:t>
+            </w:r>
+          </w:p>
+        </w:tc>
+        <w:tc>
+          <w:tcPr>
+            <w:tcW w:type="dxa" w:w="1587"/>
+          </w:tcPr>
+          <w:p>
+            <w:r/>
+            <w:r>
+              <w:rPr>
+                <w:sz w:val="15"/>
+              </w:rPr>
+              <w:t>2026-09-29 18:12</w:t>
+            </w:r>
+          </w:p>
+        </w:tc>
+        <w:tc>
+          <w:tcPr>
+            <w:tcW w:type="dxa" w:w="7143"/>
+          </w:tcPr>
+          <w:p>
+            <w:r/>
+            <w:r>
+              <w:rPr>
+                <w:sz w:val="15"/>
+              </w:rPr>
+              <w:t>Chat UI: highlight the source cell behind every number</w:t>
+            </w:r>
+          </w:p>
+        </w:tc>
+      </w:tr>
+      <w:tr>
+        <w:tc>
+          <w:tcPr>
+            <w:tcW w:type="dxa" w:w="907"/>
+          </w:tcPr>
+          <w:p>
+            <w:r/>
+            <w:r>
+              <w:rPr>
+                <w:sz w:val="15"/>
+              </w:rPr>
+              <w:t>7070de1</w:t>
+            </w:r>
+          </w:p>
+        </w:tc>
+        <w:tc>
+          <w:tcPr>
+            <w:tcW w:type="dxa" w:w="1587"/>
+          </w:tcPr>
+          <w:p>
+            <w:r/>
+            <w:r>
+              <w:rPr>
+                <w:sz w:val="15"/>
+              </w:rPr>
+              <w:t>2026-09-29 18:12</w:t>
+            </w:r>
+          </w:p>
+        </w:tc>
+        <w:tc>
+          <w:tcPr>
+            <w:tcW w:type="dxa" w:w="7143"/>
+          </w:tcPr>
+          <w:p>
+            <w:r/>
+            <w:r>
+              <w:rPr>
+                <w:sz w:val="15"/>
+              </w:rPr>
+              <w:t>Refresh the report, README and diagram through Phase 21</w:t>
+            </w:r>
+          </w:p>
+        </w:tc>
+      </w:tr>
+      <w:tr>
+        <w:tc>
+          <w:tcPr>
+            <w:tcW w:type="dxa" w:w="907"/>
+          </w:tcPr>
+          <w:p>
+            <w:r/>
+            <w:r>
+              <w:rPr>
+                <w:sz w:val="15"/>
+              </w:rPr>
+              <w:t>5265a5d</w:t>
+            </w:r>
+          </w:p>
+        </w:tc>
+        <w:tc>
+          <w:tcPr>
+            <w:tcW w:type="dxa" w:w="1587"/>
+          </w:tcPr>
+          <w:p>
+            <w:r/>
+            <w:r>
+              <w:rPr>
+                <w:sz w:val="15"/>
+              </w:rPr>
+              <w:t>2026-09-29 19:36</w:t>
+            </w:r>
+          </w:p>
+        </w:tc>
+        <w:tc>
+          <w:tcPr>
+            <w:tcW w:type="dxa" w:w="7143"/>
+          </w:tcPr>
+          <w:p>
+            <w:r/>
+            <w:r>
+              <w:rPr>
+                <w:sz w:val="15"/>
+              </w:rPr>
+              <w:t>Highlight cited numbers in the original SEC filing</w:t>
+            </w:r>
+          </w:p>
+        </w:tc>
+      </w:tr>
+      <w:tr>
+        <w:tc>
+          <w:tcPr>
+            <w:tcW w:type="dxa" w:w="907"/>
+          </w:tcPr>
+          <w:p>
+            <w:r/>
+            <w:r>
+              <w:rPr>
+                <w:sz w:val="15"/>
+              </w:rPr>
+              <w:t>655fdca</w:t>
+            </w:r>
+          </w:p>
+        </w:tc>
+        <w:tc>
+          <w:tcPr>
+            <w:tcW w:type="dxa" w:w="1587"/>
+          </w:tcPr>
+          <w:p>
+            <w:r/>
+            <w:r>
+              <w:rPr>
+                <w:sz w:val="15"/>
+              </w:rPr>
+              <w:t>2026-09-29 20:26</w:t>
+            </w:r>
+          </w:p>
+        </w:tc>
+        <w:tc>
+          <w:tcPr>
+            <w:tcW w:type="dxa" w:w="7143"/>
+          </w:tcPr>
+          <w:p>
+            <w:r/>
+            <w:r>
+              <w:rPr>
+                <w:sz w:val="15"/>
+              </w:rPr>
+              <w:t>README: 63 tested example questions for the chat UI</w:t>
             </w:r>
           </w:p>
         </w:tc>
@@ -9363,7 +9583,7 @@
         <w:rPr>
           <w:i w:val="0"/>
         </w:rPr>
-        <w:t>The check flagged 96.5% of 592 invented numbers and 0.0% of 376 wrong-cell numbers. The 21 invented numbers it missed happen to match another number in the sources or its rounding (for example $979, $44, $4), so they are indistinguishable from a wrong-cell read. A second gap: whole percentages up to 31% are skipped by the day-of-month rule, so they are never checked; 7 such percentages appear in 5 answers.</w:t>
+        <w:t>The check flagged 97.5% of 592 invented numbers and 0.0% of 376 wrong-cell numbers. The 15 invented numbers it missed happen to match another number in the sources or its rounding (for example $979, $44, $4), so they are indistinguishable from a wrong-cell read. A second gap: whole percentages up to 31% are skipped by the day-of-month rule, so they are never checked; 7 such percentages appear in 5 answers. A third gap was found later, while testing example questions, and has been fixed: amounts between 1,900 and 2,100 ('$2,002 million') were skipped as years. A $ sign or thousands comma now always marks an amount, and the figures above are from after the fix, which caught six more planted numbers.</w:t>
       </w:r>
     </w:p>
     <w:p>
@@ -10105,7 +10325,7 @@
         <w:rPr>
           <w:i w:val="0"/>
         </w:rPr>
-        <w:t>API (Phase 20): POST /query returns the answer, sub-questions, cited SEC filings with links, &lt;calc&gt; results, unverified numbers, latency and the Phoenix trace id; GET /health returns 503 until Qdrant, Ollama and the models are ready; GET /metrics reports request counts, p50/p95 and refusal and unverified-number rates. One GPU means one pipeline run at a time (asyncio lock) with at most 4 requests queued, then 503. A chat UI is served at GET /: every number in an answer is traced to the table cell or sentence it was quoted from (the Phase 17 parser), and clicking it opens the source passage with that cell highlighted.</w:t>
+        <w:t>API (Phase 20): POST /query returns the answer, sub-questions, cited SEC filings with links, &lt;calc&gt; results, unverified numbers, latency and the Phoenix trace id; GET /health returns 503 until Qdrant, Ollama and the models are ready; GET /metrics reports request counts, p50/p95 and refusal and unverified-number rates. One GPU means one pipeline run at a time (asyncio lock) with at most 4 requests queued, then 503. A chat UI is served at GET /: every number in an answer is traced to the table cell or sentence it was quoted from (the Phase 17 parser), and clicking it opens the source passage with that cell highlighted, with a link to the same spot in the original filing. A number that the filing's iXBRL tags as one business segment's figure, while the filing also reports a different company total, is flagged with the segment name and the total (e.g. Microsoft's Productivity and Business Processes operating income quoted as 'operating income').</w:t>
       </w:r>
     </w:p>
     <w:p>

</xml_diff>

<commit_message>
Report: example-question verification (section 5.18) and journey link
data/eval/results/example_questions.csv records the 80 questions asked
through the live API: answer, whether the automatic number check passed,
the outcome after checking every stated figure against the filings' iXBRL
facts, and the reason for each exclusion (63 verified: 50 numeric, 13
narrative). The report computes its new section, a summary bullet and an
outcomes table from it, and points to docs/JOURNEY.md from the chronology.
Of the 6 answers that passed the check but were wrong, 2 used the wrong
period, 2 quoted a segment as the company total and 2 contained the
model's own faulty calculation.

Co-Authored-By: Claude Opus 5.5 <noreply@anthropic.com>
</commit_message>
<xml_diff>
--- a/docs/SEC_EDGAR_RAG_Architecture_Report.docx
+++ b/docs/SEC_EDGAR_RAG_Architecture_Report.docx
@@ -104,7 +104,7 @@
           <w:i w:val="0"/>
           <w:sz w:val="20"/>
         </w:rPr>
-        <w:t>Generated 2026-09-29 from the repository state at commit 655fdca</w:t>
+        <w:t>Generated 2026-09-29 from the repository state at commit db67d05</w:t>
       </w:r>
     </w:p>
     <w:p>
@@ -302,6 +302,20 @@
       </w:r>
       <w:r>
         <w:t>without &lt;calc&gt; (G8) 87.5% of answers were correct vs 82.5% with it (G7; McNemar p = 0.50, not significant), and neither run made an arithmetic error. &lt;calc&gt; stays because it keeps the number check meaningful: without it 60% of correct answers were flagged, vs 3% with it.</w:t>
+      </w:r>
+    </w:p>
+    <w:p>
+      <w:pPr>
+        <w:pStyle w:val="ListBullet"/>
+      </w:pPr>
+      <w:r>
+        <w:rPr>
+          <w:b/>
+        </w:rPr>
+        <w:t xml:space="preserve">Tested example questions: </w:t>
+      </w:r>
+      <w:r>
+        <w:t>63 of 80 questions across 16 companies were verified against the filings' own iXBRL facts; 6 answers passed the automatic number check but quoted the wrong period, a segment instead of the total, or a wrong unit (Section 5.18).</w:t>
       </w:r>
     </w:p>
     <w:p>
@@ -3775,7 +3789,7 @@
         <w:rPr>
           <w:i w:val="0"/>
         </w:rPr>
-        <w:t>The project followed a frozen plan with checkpoints (data, retrieval, reranking, generation, production). Three deviations are recorded: a local-LLM feasibility benchmark was inserted before generation, sub-question decomposition (Phase 14) was done before Ragas (Phase 13) because multi-fact questions were the largest measured gap, and the serving phases (19-21) were built before the numerical-hallucination evaluation (Phase 17); vector quantization (Phase 18) is still open.</w:t>
+        <w:t>The project followed a frozen plan with checkpoints (data, retrieval, reranking, generation, production). Three deviations are recorded: a local-LLM feasibility benchmark was inserted before generation, sub-question decomposition (Phase 14) was done before Ragas (Phase 13) because multi-fact questions were the largest measured gap, and the serving phases (19-21) were built before the numerical-hallucination evaluation (Phase 17); vector quantization (Phase 18) is still open. docs/JOURNEY.md draws the whole chronology as flowcharts: for each step, the problems that came up, the fixes and the measurement that confirmed them.</w:t>
       </w:r>
     </w:p>
     <w:p>
@@ -5345,6 +5359,182 @@
                 <w:sz w:val="15"/>
               </w:rPr>
               <w:t>README: 63 tested example questions for the chat UI</w:t>
+            </w:r>
+          </w:p>
+        </w:tc>
+      </w:tr>
+      <w:tr>
+        <w:tc>
+          <w:tcPr>
+            <w:tcW w:type="dxa" w:w="907"/>
+          </w:tcPr>
+          <w:p>
+            <w:r/>
+            <w:r>
+              <w:rPr>
+                <w:sz w:val="15"/>
+              </w:rPr>
+              <w:t>aa613c9</w:t>
+            </w:r>
+          </w:p>
+        </w:tc>
+        <w:tc>
+          <w:tcPr>
+            <w:tcW w:type="dxa" w:w="1587"/>
+          </w:tcPr>
+          <w:p>
+            <w:r/>
+            <w:r>
+              <w:rPr>
+                <w:sz w:val="15"/>
+              </w:rPr>
+              <w:t>2026-09-29 21:17</w:t>
+            </w:r>
+          </w:p>
+        </w:tc>
+        <w:tc>
+          <w:tcPr>
+            <w:tcW w:type="dxa" w:w="7143"/>
+          </w:tcPr>
+          <w:p>
+            <w:r/>
+            <w:r>
+              <w:rPr>
+                <w:sz w:val="15"/>
+              </w:rPr>
+              <w:t>Number check: verify year-like amounts; flag segment figures</w:t>
+            </w:r>
+          </w:p>
+        </w:tc>
+      </w:tr>
+      <w:tr>
+        <w:tc>
+          <w:tcPr>
+            <w:tcW w:type="dxa" w:w="907"/>
+          </w:tcPr>
+          <w:p>
+            <w:r/>
+            <w:r>
+              <w:rPr>
+                <w:sz w:val="15"/>
+              </w:rPr>
+              <w:t>1c649f0</w:t>
+            </w:r>
+          </w:p>
+        </w:tc>
+        <w:tc>
+          <w:tcPr>
+            <w:tcW w:type="dxa" w:w="1587"/>
+          </w:tcPr>
+          <w:p>
+            <w:r/>
+            <w:r>
+              <w:rPr>
+                <w:sz w:val="15"/>
+              </w:rPr>
+              <w:t>2026-09-29 21:18</w:t>
+            </w:r>
+          </w:p>
+        </w:tc>
+        <w:tc>
+          <w:tcPr>
+            <w:tcW w:type="dxa" w:w="7143"/>
+          </w:tcPr>
+          <w:p>
+            <w:r/>
+            <w:r>
+              <w:rPr>
+                <w:sz w:val="15"/>
+              </w:rPr>
+              <w:t>Report figure 7: stress-test rates after the year-like amount fix</w:t>
+            </w:r>
+          </w:p>
+        </w:tc>
+      </w:tr>
+      <w:tr>
+        <w:tc>
+          <w:tcPr>
+            <w:tcW w:type="dxa" w:w="907"/>
+          </w:tcPr>
+          <w:p>
+            <w:r/>
+            <w:r>
+              <w:rPr>
+                <w:sz w:val="15"/>
+              </w:rPr>
+              <w:t>8d26291</w:t>
+            </w:r>
+          </w:p>
+        </w:tc>
+        <w:tc>
+          <w:tcPr>
+            <w:tcW w:type="dxa" w:w="1587"/>
+          </w:tcPr>
+          <w:p>
+            <w:r/>
+            <w:r>
+              <w:rPr>
+                <w:sz w:val="15"/>
+              </w:rPr>
+              <w:t>2026-09-29 21:29</w:t>
+            </w:r>
+          </w:p>
+        </w:tc>
+        <w:tc>
+          <w:tcPr>
+            <w:tcW w:type="dxa" w:w="7143"/>
+          </w:tcPr>
+          <w:p>
+            <w:r/>
+            <w:r>
+              <w:rPr>
+                <w:sz w:val="15"/>
+              </w:rPr>
+              <w:t>Decomposition cache: sub-questions from the example-question runs</w:t>
+            </w:r>
+          </w:p>
+        </w:tc>
+      </w:tr>
+      <w:tr>
+        <w:tc>
+          <w:tcPr>
+            <w:tcW w:type="dxa" w:w="907"/>
+          </w:tcPr>
+          <w:p>
+            <w:r/>
+            <w:r>
+              <w:rPr>
+                <w:sz w:val="15"/>
+              </w:rPr>
+              <w:t>db67d05</w:t>
+            </w:r>
+          </w:p>
+        </w:tc>
+        <w:tc>
+          <w:tcPr>
+            <w:tcW w:type="dxa" w:w="1587"/>
+          </w:tcPr>
+          <w:p>
+            <w:r/>
+            <w:r>
+              <w:rPr>
+                <w:sz w:val="15"/>
+              </w:rPr>
+              <w:t>2026-09-29 21:51</w:t>
+            </w:r>
+          </w:p>
+        </w:tc>
+        <w:tc>
+          <w:tcPr>
+            <w:tcW w:type="dxa" w:w="7143"/>
+          </w:tcPr>
+          <w:p>
+            <w:r/>
+            <w:r>
+              <w:rPr>
+                <w:sz w:val="15"/>
+              </w:rPr>
+              <w:t>Project journey: how each step was built, broken, fixed and measured</w:t>
             </w:r>
           </w:p>
         </w:tc>
@@ -10351,6 +10541,469 @@
     </w:p>
     <w:p>
       <w:pPr>
+        <w:pStyle w:val="Heading2"/>
+      </w:pPr>
+      <w:r>
+        <w:t>5.18 Example questions: answers checked against the filings' own tags</w:t>
+      </w:r>
+    </w:p>
+    <w:p>
+      <w:pPr>
+        <w:spacing w:after="40"/>
+        <w:ind w:left="227"/>
+      </w:pPr>
+      <w:r>
+        <w:rPr>
+          <w:b/>
+          <w:color w:val="2F5496"/>
+          <w:sz w:val="19"/>
+        </w:rPr>
+        <w:t xml:space="preserve">Goal: </w:t>
+      </w:r>
+      <w:r>
+        <w:rPr>
+          <w:sz w:val="19"/>
+        </w:rPr>
+        <w:t>a list of questions users can rely on, and a stricter end-to-end test across 16 companies.</w:t>
+      </w:r>
+    </w:p>
+    <w:p>
+      <w:pPr>
+        <w:spacing w:after="40"/>
+        <w:ind w:left="227"/>
+      </w:pPr>
+      <w:r>
+        <w:rPr>
+          <w:b/>
+          <w:color w:val="2F5496"/>
+          <w:sz w:val="19"/>
+        </w:rPr>
+        <w:t xml:space="preserve">Built: </w:t>
+      </w:r>
+      <w:r>
+        <w:rPr>
+          <w:sz w:val="19"/>
+        </w:rPr>
+        <w:t>data/eval/results/example_questions.csv; the 'Example questions for the chat UI' section of README.md</w:t>
+      </w:r>
+    </w:p>
+    <w:p>
+      <w:pPr>
+        <w:spacing w:after="40"/>
+        <w:ind w:left="227"/>
+      </w:pPr>
+      <w:r>
+        <w:rPr>
+          <w:b/>
+          <w:color w:val="2F5496"/>
+          <w:sz w:val="19"/>
+        </w:rPr>
+        <w:t xml:space="preserve">Checkpoint verdict: </w:t>
+      </w:r>
+      <w:r>
+        <w:rPr>
+          <w:sz w:val="19"/>
+        </w:rPr>
+        <w:t>63 of 80 verified; the automatic number check alone was not enough, and the review found two bugs in it (fixed, Sections 5.16 and 5.17).</w:t>
+      </w:r>
+    </w:p>
+    <w:p>
+      <w:pPr>
+        <w:spacing w:after="40"/>
+      </w:pPr>
+    </w:p>
+    <w:p>
+      <w:r>
+        <w:rPr>
+          <w:i w:val="0"/>
+        </w:rPr>
+        <w:t>80 questions across eight types (single quarter, annual, balance sheet and cash flow, year over year, percentage change, quarter vs quarter, company vs company, narrative) were asked through the live API of the Docker stack; 10 of them rephrase first-round failures with exact period-end dates. 69 passed the automatic check: an answer, with citations, and every number found in a source. Each number stated in a numeric answer was then looked up among the tagged iXBRL facts of that company's filings, which name the concept, the reporting period and any segment. An answer counted as verified only if every stated figure is a fact with the asked concept and period and is not a single segment's figure; narrative answers had to be cited and grounded.</w:t>
+      </w:r>
+    </w:p>
+    <w:p>
+      <w:pPr>
+        <w:keepNext/>
+        <w:spacing w:after="40"/>
+      </w:pPr>
+      <w:r>
+        <w:rPr>
+          <w:b/>
+          <w:sz w:val="18"/>
+        </w:rPr>
+        <w:t>Table 9. Outcome of the 80 example questions</w:t>
+      </w:r>
+    </w:p>
+    <w:tbl>
+      <w:tblPr>
+        <w:tblStyle w:val="TableGrid"/>
+        <w:tblW w:type="auto" w:w="0"/>
+        <w:jc w:val="center"/>
+        <w:tblLook w:firstColumn="1" w:firstRow="1" w:lastColumn="0" w:lastRow="0" w:noHBand="0" w:noVBand="1" w:val="04A0"/>
+      </w:tblPr>
+      <w:tblGrid>
+        <w:gridCol w:w="2353"/>
+        <w:gridCol w:w="2353"/>
+        <w:gridCol w:w="2353"/>
+        <w:gridCol w:w="2353"/>
+      </w:tblGrid>
+      <w:tr>
+        <w:tc>
+          <w:tcPr>
+            <w:tcW w:type="dxa" w:w="2353"/>
+            <w:shd w:val="clear" w:color="auto" w:fill="D9E2F3"/>
+          </w:tcPr>
+          <w:p>
+            <w:r/>
+            <w:r>
+              <w:rPr>
+                <w:b/>
+                <w:sz w:val="17"/>
+              </w:rPr>
+              <w:t>Outcome</w:t>
+            </w:r>
+          </w:p>
+        </w:tc>
+        <w:tc>
+          <w:tcPr>
+            <w:tcW w:type="dxa" w:w="2353"/>
+            <w:shd w:val="clear" w:color="auto" w:fill="D9E2F3"/>
+          </w:tcPr>
+          <w:p>
+            <w:r/>
+            <w:r>
+              <w:rPr>
+                <w:b/>
+                <w:sz w:val="17"/>
+              </w:rPr>
+              <w:t>numeric</w:t>
+            </w:r>
+          </w:p>
+        </w:tc>
+        <w:tc>
+          <w:tcPr>
+            <w:tcW w:type="dxa" w:w="2353"/>
+            <w:shd w:val="clear" w:color="auto" w:fill="D9E2F3"/>
+          </w:tcPr>
+          <w:p>
+            <w:r/>
+            <w:r>
+              <w:rPr>
+                <w:b/>
+                <w:sz w:val="17"/>
+              </w:rPr>
+              <w:t>narrative</w:t>
+            </w:r>
+          </w:p>
+        </w:tc>
+        <w:tc>
+          <w:tcPr>
+            <w:tcW w:type="dxa" w:w="2353"/>
+            <w:shd w:val="clear" w:color="auto" w:fill="D9E2F3"/>
+          </w:tcPr>
+          <w:p>
+            <w:r/>
+            <w:r>
+              <w:rPr>
+                <w:b/>
+                <w:sz w:val="17"/>
+              </w:rPr>
+              <w:t>total</w:t>
+            </w:r>
+          </w:p>
+        </w:tc>
+      </w:tr>
+      <w:tr>
+        <w:tc>
+          <w:tcPr>
+            <w:tcW w:type="dxa" w:w="2353"/>
+          </w:tcPr>
+          <w:p>
+            <w:r/>
+            <w:r>
+              <w:rPr>
+                <w:sz w:val="17"/>
+              </w:rPr>
+              <w:t>verified</w:t>
+            </w:r>
+          </w:p>
+        </w:tc>
+        <w:tc>
+          <w:tcPr>
+            <w:tcW w:type="dxa" w:w="2353"/>
+          </w:tcPr>
+          <w:p>
+            <w:pPr>
+              <w:jc w:val="right"/>
+            </w:pPr>
+            <w:r/>
+            <w:r>
+              <w:rPr>
+                <w:sz w:val="17"/>
+              </w:rPr>
+              <w:t>50</w:t>
+            </w:r>
+          </w:p>
+        </w:tc>
+        <w:tc>
+          <w:tcPr>
+            <w:tcW w:type="dxa" w:w="2353"/>
+          </w:tcPr>
+          <w:p>
+            <w:pPr>
+              <w:jc w:val="right"/>
+            </w:pPr>
+            <w:r/>
+            <w:r>
+              <w:rPr>
+                <w:sz w:val="17"/>
+              </w:rPr>
+              <w:t>13</w:t>
+            </w:r>
+          </w:p>
+        </w:tc>
+        <w:tc>
+          <w:tcPr>
+            <w:tcW w:type="dxa" w:w="2353"/>
+          </w:tcPr>
+          <w:p>
+            <w:pPr>
+              <w:jc w:val="right"/>
+            </w:pPr>
+            <w:r/>
+            <w:r>
+              <w:rPr>
+                <w:sz w:val="17"/>
+              </w:rPr>
+              <w:t>63</w:t>
+            </w:r>
+          </w:p>
+        </w:tc>
+      </w:tr>
+      <w:tr>
+        <w:tc>
+          <w:tcPr>
+            <w:tcW w:type="dxa" w:w="2353"/>
+          </w:tcPr>
+          <w:p>
+            <w:r/>
+            <w:r>
+              <w:rPr>
+                <w:sz w:val="17"/>
+              </w:rPr>
+              <w:t>wrong</w:t>
+            </w:r>
+          </w:p>
+        </w:tc>
+        <w:tc>
+          <w:tcPr>
+            <w:tcW w:type="dxa" w:w="2353"/>
+          </w:tcPr>
+          <w:p>
+            <w:pPr>
+              <w:jc w:val="right"/>
+            </w:pPr>
+            <w:r/>
+            <w:r>
+              <w:rPr>
+                <w:sz w:val="17"/>
+              </w:rPr>
+              <w:t>6</w:t>
+            </w:r>
+          </w:p>
+        </w:tc>
+        <w:tc>
+          <w:tcPr>
+            <w:tcW w:type="dxa" w:w="2353"/>
+          </w:tcPr>
+          <w:p>
+            <w:pPr>
+              <w:jc w:val="right"/>
+            </w:pPr>
+            <w:r/>
+            <w:r>
+              <w:rPr>
+                <w:sz w:val="17"/>
+              </w:rPr>
+              <w:t>0</w:t>
+            </w:r>
+          </w:p>
+        </w:tc>
+        <w:tc>
+          <w:tcPr>
+            <w:tcW w:type="dxa" w:w="2353"/>
+          </w:tcPr>
+          <w:p>
+            <w:pPr>
+              <w:jc w:val="right"/>
+            </w:pPr>
+            <w:r/>
+            <w:r>
+              <w:rPr>
+                <w:sz w:val="17"/>
+              </w:rPr>
+              <w:t>6</w:t>
+            </w:r>
+          </w:p>
+        </w:tc>
+      </w:tr>
+      <w:tr>
+        <w:tc>
+          <w:tcPr>
+            <w:tcW w:type="dxa" w:w="2353"/>
+          </w:tcPr>
+          <w:p>
+            <w:r/>
+            <w:r>
+              <w:rPr>
+                <w:sz w:val="17"/>
+              </w:rPr>
+              <w:t>not grounded</w:t>
+            </w:r>
+          </w:p>
+        </w:tc>
+        <w:tc>
+          <w:tcPr>
+            <w:tcW w:type="dxa" w:w="2353"/>
+          </w:tcPr>
+          <w:p>
+            <w:pPr>
+              <w:jc w:val="right"/>
+            </w:pPr>
+            <w:r/>
+            <w:r>
+              <w:rPr>
+                <w:sz w:val="17"/>
+              </w:rPr>
+              <w:t>6</w:t>
+            </w:r>
+          </w:p>
+        </w:tc>
+        <w:tc>
+          <w:tcPr>
+            <w:tcW w:type="dxa" w:w="2353"/>
+          </w:tcPr>
+          <w:p>
+            <w:pPr>
+              <w:jc w:val="right"/>
+            </w:pPr>
+            <w:r/>
+            <w:r>
+              <w:rPr>
+                <w:sz w:val="17"/>
+              </w:rPr>
+              <w:t>1</w:t>
+            </w:r>
+          </w:p>
+        </w:tc>
+        <w:tc>
+          <w:tcPr>
+            <w:tcW w:type="dxa" w:w="2353"/>
+          </w:tcPr>
+          <w:p>
+            <w:pPr>
+              <w:jc w:val="right"/>
+            </w:pPr>
+            <w:r/>
+            <w:r>
+              <w:rPr>
+                <w:sz w:val="17"/>
+              </w:rPr>
+              <w:t>7</w:t>
+            </w:r>
+          </w:p>
+        </w:tc>
+      </w:tr>
+      <w:tr>
+        <w:tc>
+          <w:tcPr>
+            <w:tcW w:type="dxa" w:w="2353"/>
+          </w:tcPr>
+          <w:p>
+            <w:r/>
+            <w:r>
+              <w:rPr>
+                <w:sz w:val="17"/>
+              </w:rPr>
+              <w:t>refused</w:t>
+            </w:r>
+          </w:p>
+        </w:tc>
+        <w:tc>
+          <w:tcPr>
+            <w:tcW w:type="dxa" w:w="2353"/>
+          </w:tcPr>
+          <w:p>
+            <w:pPr>
+              <w:jc w:val="right"/>
+            </w:pPr>
+            <w:r/>
+            <w:r>
+              <w:rPr>
+                <w:sz w:val="17"/>
+              </w:rPr>
+              <w:t>2</w:t>
+            </w:r>
+          </w:p>
+        </w:tc>
+        <w:tc>
+          <w:tcPr>
+            <w:tcW w:type="dxa" w:w="2353"/>
+          </w:tcPr>
+          <w:p>
+            <w:pPr>
+              <w:jc w:val="right"/>
+            </w:pPr>
+            <w:r/>
+            <w:r>
+              <w:rPr>
+                <w:sz w:val="17"/>
+              </w:rPr>
+              <w:t>2</w:t>
+            </w:r>
+          </w:p>
+        </w:tc>
+        <w:tc>
+          <w:tcPr>
+            <w:tcW w:type="dxa" w:w="2353"/>
+          </w:tcPr>
+          <w:p>
+            <w:pPr>
+              <w:jc w:val="right"/>
+            </w:pPr>
+            <w:r/>
+            <w:r>
+              <w:rPr>
+                <w:sz w:val="17"/>
+              </w:rPr>
+              <w:t>4</w:t>
+            </w:r>
+          </w:p>
+        </w:tc>
+      </w:tr>
+    </w:tbl>
+    <w:p>
+      <w:pPr>
+        <w:spacing w:after="200"/>
+      </w:pPr>
+      <w:r>
+        <w:rPr>
+          <w:i/>
+          <w:color w:val="666666"/>
+          <w:sz w:val="16"/>
+        </w:rPr>
+        <w:t>Source: data/eval/results/example_questions.csv</w:t>
+      </w:r>
+    </w:p>
+    <w:p>
+      <w:r>
+        <w:rPr>
+          <w:i w:val="0"/>
+        </w:rPr>
+        <w:t>Of the 6 answers that passed the automatic check but were wrong, 2 used the wrong period (six-month or year-to-date figures), 2 quoted a single segment as the company total, and 2 contained the model's own faulty calculation (a percentage no filing figure supports, and a unit error). The first two kinds quote real figures from the right filing, so a check that only asks whether a number appears in the sources cannot tell them from the right ones: these are the wrong-cell errors Phase 17 measured, now seen on live questions. The last kind passed because the check accepts calculated numbers. The same review found two bugs in the check itself: amounts between 1,900 and 2,100 ('$2,002 million') were skipped as years, and a segment figure passed as the company total. Both are fixed (Sections 5.16 and 5.17). The verified questions are listed in the README as examples for the chat UI; their median answer time was 10 s.</w:t>
+      </w:r>
+    </w:p>
+    <w:p>
+      <w:pPr>
         <w:pStyle w:val="Heading1"/>
       </w:pPr>
       <w:r>
@@ -10375,7 +11028,7 @@
           <w:b/>
           <w:sz w:val="18"/>
         </w:rPr>
-        <w:t>Table 9. Retrieval, eval v0</w:t>
+        <w:t>Table 10. Retrieval, eval v0</w:t>
       </w:r>
     </w:p>
     <w:tbl>
@@ -11375,7 +12028,7 @@
           <w:b/>
           <w:sz w:val="18"/>
         </w:rPr>
-        <w:t>Table 10. Retrieval, eval v1</w:t>
+        <w:t>Table 11. Retrieval, eval v1</w:t>
       </w:r>
     </w:p>
     <w:tbl>
@@ -12586,7 +13239,7 @@
           <w:b/>
           <w:sz w:val="18"/>
         </w:rPr>
-        <w:t>Table 11. Paired bootstrap over questions (recomputed from per-query files)</w:t>
+        <w:t>Table 12. Paired bootstrap over questions (recomputed from per-query files)</w:t>
       </w:r>
     </w:p>
     <w:tbl>
@@ -13933,7 +14586,7 @@
           <w:b/>
           <w:sz w:val="18"/>
         </w:rPr>
-        <w:t>Table 12. Generation runs (answer-keyed questions only)</w:t>
+        <w:t>Table 13. Generation runs (answer-keyed questions only)</w:t>
       </w:r>
     </w:p>
     <w:tbl>
@@ -15501,7 +16154,7 @@
           <w:b/>
           <w:sz w:val="18"/>
         </w:rPr>
-        <w:t>Table 13. Bottlenecks and fixes (chronological)</w:t>
+        <w:t>Table 14. Bottlenecks and fixes (chronological)</w:t>
       </w:r>
     </w:p>
     <w:tbl>
@@ -18094,7 +18747,7 @@
           <w:b/>
           <w:sz w:val="18"/>
         </w:rPr>
-        <w:t>Table 14. Selected configuration values</w:t>
+        <w:t>Table 15. Selected configuration values</w:t>
       </w:r>
     </w:p>
     <w:tbl>
@@ -18624,7 +19277,7 @@
           <w:b/>
           <w:sz w:val="18"/>
         </w:rPr>
-        <w:t>Table 15. Glossary</w:t>
+        <w:t>Table 16. Glossary</w:t>
       </w:r>
     </w:p>
     <w:tbl>
@@ -19171,7 +19824,7 @@
           <w:b/>
           <w:sz w:val="18"/>
         </w:rPr>
-        <w:t>Table 16. Run IDs (alphabetical)</w:t>
+        <w:t>Table 17. Run IDs (alphabetical)</w:t>
       </w:r>
     </w:p>
     <w:tbl>

</xml_diff>